<commit_message>
Updated Word document with latest modifications
</commit_message>
<xml_diff>
--- a/exam-c1/parci.docx
+++ b/exam-c1/parci.docx
@@ -156,6 +156,90 @@
           </wp:inline>
         </w:drawing>
       </w:r>
+    </w:p>
+    <w:p>
+      <w:pPr>
+        <w:rPr>
+          <w:u w:val="single"/>
+        </w:rPr>
+      </w:pPr>
+    </w:p>
+    <w:p>
+      <w:pPr>
+        <w:rPr>
+          <w:u w:val="single"/>
+        </w:rPr>
+      </w:pPr>
+    </w:p>
+    <w:p>
+      <w:pPr>
+        <w:rPr>
+          <w:u w:val="single"/>
+        </w:rPr>
+      </w:pPr>
+      <w:r>
+        <w:rPr>
+          <w:u w:val="single"/>
+        </w:rPr>
+        <w:t xml:space="preserve">Link del repositorio: </w:t>
+      </w:r>
+      <w:hyperlink r:id="rId6" w:history="1">
+        <w:r>
+          <w:rPr>
+            <w:rStyle w:val="Hipervnculo"/>
+          </w:rPr>
+          <w:t>https://github.com/Dannamo34/programacion-movil-2025-a-g1/blob/feature/exam/exam-c1/descripcion.txt</w:t>
+        </w:r>
+      </w:hyperlink>
+    </w:p>
+    <w:p>
+      <w:pPr>
+        <w:rPr>
+          <w:u w:val="single"/>
+        </w:rPr>
+      </w:pPr>
+    </w:p>
+    <w:p>
+      <w:pPr>
+        <w:rPr>
+          <w:u w:val="single"/>
+        </w:rPr>
+      </w:pPr>
+      <w:r>
+        <w:rPr>
+          <w:u w:val="single"/>
+        </w:rPr>
+        <w:t xml:space="preserve">Link del </w:t>
+      </w:r>
+      <w:proofErr w:type="spellStart"/>
+      <w:r>
+        <w:rPr>
+          <w:u w:val="single"/>
+        </w:rPr>
+        <w:t>figma</w:t>
+      </w:r>
+      <w:proofErr w:type="spellEnd"/>
+      <w:r>
+        <w:rPr>
+          <w:u w:val="single"/>
+        </w:rPr>
+        <w:t xml:space="preserve">: </w:t>
+      </w:r>
+      <w:hyperlink r:id="rId7" w:history="1">
+        <w:r>
+          <w:rPr>
+            <w:rStyle w:val="Hipervnculo"/>
+          </w:rPr>
+          <w:t>https://www.figma.com/proto/sbasvfPTIB58LewikaUNGS/Untitled?node-id=1-2&amp;p=f&amp;t=rlGyFFI0vrPJlkqU-0&amp;scaling=scale-down&amp;content-scaling=fixed&amp;page-id=0%3A1&amp;starting-point-node-id=1%3A2</w:t>
+        </w:r>
+      </w:hyperlink>
+    </w:p>
+    <w:p>
+      <w:pPr>
+        <w:rPr>
+          <w:u w:val="single"/>
+        </w:rPr>
+      </w:pPr>
     </w:p>
     <w:sectPr>
       <w:pgSz w:w="12240" w:h="15840"/>
@@ -1084,6 +1168,29 @@
       <w:spacing w:val="5"/>
     </w:rPr>
   </w:style>
+  <w:style w:type="character" w:styleId="Hipervnculo">
+    <w:name w:val="Hyperlink"/>
+    <w:basedOn w:val="Fuentedeprrafopredeter"/>
+    <w:uiPriority w:val="99"/>
+    <w:unhideWhenUsed/>
+    <w:rsid w:val="00DB7681"/>
+    <w:rPr>
+      <w:color w:val="467886" w:themeColor="hyperlink"/>
+      <w:u w:val="single"/>
+    </w:rPr>
+  </w:style>
+  <w:style w:type="character" w:styleId="Mencinsinresolver">
+    <w:name w:val="Unresolved Mention"/>
+    <w:basedOn w:val="Fuentedeprrafopredeter"/>
+    <w:uiPriority w:val="99"/>
+    <w:semiHidden/>
+    <w:unhideWhenUsed/>
+    <w:rsid w:val="00DB7681"/>
+    <w:rPr>
+      <w:color w:val="605E5C"/>
+      <w:shd w:val="clear" w:color="auto" w:fill="E1DFDD"/>
+    </w:rPr>
+  </w:style>
 </w:styles>
 </file>
 

</xml_diff>